<commit_message>
feat: export best hyperparameters to xlsx, fix 02d filename, add 06d imaging+clinical results (AUC 0.741)
</commit_message>
<xml_diff>
--- a/Reviewer 3.docx
+++ b/Reviewer 3.docx
@@ -272,18 +272,30 @@
       <w:pPr>
         <w:rPr>
           <w:rFonts w:ascii="更纱黑体 SC" w:hAnsi="更纱黑体 SC" w:cs="更纱黑体 SC"/>
-        </w:rPr>
-      </w:pPr>
-      <w:r>
-        <w:rPr>
-          <w:rFonts w:ascii="更纱黑体 SC" w:hAnsi="更纱黑体 SC" w:cs="更纱黑体 SC"/>
-        </w:rPr>
-        <w:t xml:space="preserve">- SHAP analysis is applied post-hoc to identify influential features, but the interpretation remains descriptive rather than clinically actionable. The manuscript does not validate whether the highlighted features (e.g., firstorder_90Percentile, </w:t>
+          <w:b/>
+          <w:bCs/>
+        </w:rPr>
+      </w:pPr>
+      <w:r>
+        <w:rPr>
+          <w:rFonts w:ascii="更纱黑体 SC" w:hAnsi="更纱黑体 SC" w:cs="更纱黑体 SC"/>
+        </w:rPr>
+        <w:t xml:space="preserve">- </w:t>
+      </w:r>
+      <w:r>
+        <w:rPr>
+          <w:rFonts w:ascii="更纱黑体 SC" w:hAnsi="更纱黑体 SC" w:cs="更纱黑体 SC"/>
+          <w:b/>
+          <w:bCs/>
+        </w:rPr>
+        <w:t xml:space="preserve">SHAP analysis is applied post-hoc to identify influential features, but the interpretation remains descriptive rather than clinically actionable. The manuscript does not validate whether the highlighted features (e.g., firstorder_90Percentile, </w:t>
       </w:r>
       <w:proofErr w:type="spellStart"/>
       <w:r>
         <w:rPr>
           <w:rFonts w:ascii="更纱黑体 SC" w:hAnsi="更纱黑体 SC" w:cs="更纱黑体 SC"/>
+          <w:b/>
+          <w:bCs/>
         </w:rPr>
         <w:t>glrlm_RunEntropy</w:t>
       </w:r>
@@ -291,48 +303,120 @@
       <w:r>
         <w:rPr>
           <w:rFonts w:ascii="更纱黑体 SC" w:hAnsi="更纱黑体 SC" w:cs="更纱黑体 SC"/>
-        </w:rPr>
-        <w:t>) align with known radiological signs of RMPP or provide novel pathophysiological insights. Without clinical validation of the interpretability outputs, the explainability component adds limited scholarly value.</w:t>
-      </w:r>
-    </w:p>
-    <w:p>
-      <w:pPr>
-        <w:rPr>
-          <w:rFonts w:ascii="更纱黑体 SC" w:hAnsi="更纱黑体 SC" w:cs="更纱黑体 SC"/>
-        </w:rPr>
-      </w:pPr>
-    </w:p>
-    <w:p>
-      <w:pPr>
-        <w:rPr>
-          <w:rFonts w:ascii="更纱黑体 SC" w:hAnsi="更纱黑体 SC" w:cs="更纱黑体 SC"/>
-        </w:rPr>
-      </w:pPr>
-      <w:r>
-        <w:rPr>
-          <w:rFonts w:ascii="更纱黑体 SC" w:hAnsi="更纱黑体 SC" w:cs="更纱黑体 SC"/>
-        </w:rPr>
-        <w:t xml:space="preserve">- The statistical analysis section describes multiple tests (t-tests, Welch's t-tests, Mann-Whitney U tests, chi-square tests) but does not clarify how multiple comparison </w:t>
+          <w:b/>
+          <w:bCs/>
+        </w:rPr>
+        <w:t xml:space="preserve">) align with known radiological signs of RMPP or provide novel </w:t>
+      </w:r>
+      <w:r>
+        <w:rPr>
+          <w:rFonts w:ascii="更纱黑体 SC" w:hAnsi="更纱黑体 SC" w:cs="更纱黑体 SC"/>
+          <w:b/>
+          <w:bCs/>
+          <w:color w:val="EE0000"/>
+        </w:rPr>
+        <w:t xml:space="preserve">pathophysiological </w:t>
+      </w:r>
+      <w:r>
+        <w:rPr>
+          <w:rFonts w:ascii="更纱黑体 SC" w:hAnsi="更纱黑体 SC" w:cs="更纱黑体 SC"/>
+          <w:b/>
+          <w:bCs/>
+        </w:rPr>
+        <w:t xml:space="preserve">insights. Without </w:t>
+      </w:r>
+      <w:r>
+        <w:rPr>
+          <w:rFonts w:ascii="更纱黑体 SC" w:hAnsi="更纱黑体 SC" w:cs="更纱黑体 SC"/>
+          <w:b/>
+          <w:bCs/>
+          <w:color w:val="EE0000"/>
+        </w:rPr>
+        <w:t>clinical validation</w:t>
+      </w:r>
+      <w:r>
+        <w:rPr>
+          <w:rFonts w:ascii="更纱黑体 SC" w:hAnsi="更纱黑体 SC" w:cs="更纱黑体 SC"/>
+          <w:b/>
+          <w:bCs/>
+        </w:rPr>
+        <w:t xml:space="preserve"> of the interpretability outputs, the explainability component adds limited scholarly value.</w:t>
+      </w:r>
+    </w:p>
+    <w:p>
+      <w:pPr>
+        <w:rPr>
+          <w:rFonts w:ascii="更纱黑体 SC" w:hAnsi="更纱黑体 SC" w:cs="更纱黑体 SC"/>
+        </w:rPr>
+      </w:pPr>
+    </w:p>
+    <w:p>
+      <w:pPr>
+        <w:rPr>
+          <w:rFonts w:ascii="更纱黑体 SC" w:hAnsi="更纱黑体 SC" w:cs="更纱黑体 SC"/>
+        </w:rPr>
+      </w:pPr>
+      <w:r>
+        <w:rPr>
+          <w:rFonts w:ascii="更纱黑体 SC" w:hAnsi="更纱黑体 SC" w:cs="更纱黑体 SC"/>
+        </w:rPr>
+        <w:t xml:space="preserve">- The statistical analysis section describes multiple tests (t-tests, Welch's t-tests, Mann-Whitney U tests, chi-square tests) but does not clarify how </w:t>
+      </w:r>
+      <w:r>
+        <w:rPr>
+          <w:rFonts w:ascii="更纱黑体 SC" w:hAnsi="更纱黑体 SC" w:cs="更纱黑体 SC"/>
+          <w:b/>
+          <w:bCs/>
+          <w:color w:val="EE0000"/>
+        </w:rPr>
+        <w:t xml:space="preserve">multiple comparison </w:t>
       </w:r>
       <w:proofErr w:type="gramStart"/>
       <w:r>
         <w:rPr>
           <w:rFonts w:ascii="更纱黑体 SC" w:hAnsi="更纱黑体 SC" w:cs="更纱黑体 SC"/>
-        </w:rPr>
-        <w:t>correction was</w:t>
+          <w:b/>
+          <w:bCs/>
+          <w:color w:val="EE0000"/>
+        </w:rPr>
+        <w:t>correction</w:t>
+      </w:r>
+      <w:r>
+        <w:rPr>
+          <w:rFonts w:ascii="更纱黑体 SC" w:hAnsi="更纱黑体 SC" w:cs="更纱黑体 SC"/>
+        </w:rPr>
+        <w:t xml:space="preserve"> was</w:t>
       </w:r>
       <w:proofErr w:type="gramEnd"/>
       <w:r>
         <w:rPr>
           <w:rFonts w:ascii="更纱黑体 SC" w:hAnsi="更纱黑体 SC" w:cs="更纱黑体 SC"/>
         </w:rPr>
-        <w:t xml:space="preserve"> applied across the numerous baseline characteristics and model evaluations. Additionally, confidence intervals </w:t>
-      </w:r>
-      <w:r>
-        <w:rPr>
-          <w:rFonts w:ascii="更纱黑体 SC" w:hAnsi="更纱黑体 SC" w:cs="更纱黑体 SC"/>
+        <w:t xml:space="preserve"> applied across the numerous baseline characteristics and model evaluations. Additionally, </w:t>
+      </w:r>
+      <w:r>
+        <w:rPr>
+          <w:rFonts w:ascii="更纱黑体 SC" w:hAnsi="更纱黑体 SC" w:cs="更纱黑体 SC"/>
+          <w:b/>
+          <w:bCs/>
+          <w:color w:val="EE0000"/>
+        </w:rPr>
+        <w:t xml:space="preserve">confidence </w:t>
+      </w:r>
+      <w:r>
+        <w:rPr>
+          <w:rFonts w:ascii="更纱黑体 SC" w:hAnsi="更纱黑体 SC" w:cs="更纱黑体 SC"/>
+          <w:b/>
+          <w:bCs/>
+          <w:color w:val="EE0000"/>
         </w:rPr>
         <w:lastRenderedPageBreak/>
+        <w:t xml:space="preserve">intervals </w:t>
+      </w:r>
+      <w:r>
+        <w:rPr>
+          <w:rFonts w:ascii="更纱黑体 SC" w:hAnsi="更纱黑体 SC" w:cs="更纱黑体 SC"/>
+        </w:rPr>
         <w:t>for performance metrics are not reported, limiting assessment of estimate precision.</w:t>
       </w:r>
     </w:p>
@@ -365,6 +449,44 @@
     </w:sectPr>
   </w:body>
 </w:document>
+</file>
+
+<file path=word/endnotes.xml><?xml version="1.0" encoding="utf-8"?>
+<w:endnotes xmlns:wpc="http://schemas.microsoft.com/office/word/2010/wordprocessingCanvas" xmlns:cx="http://schemas.microsoft.com/office/drawing/2014/chartex" xmlns:cx1="http://schemas.microsoft.com/office/drawing/2015/9/8/chartex" xmlns:cx2="http://schemas.microsoft.com/office/drawing/2015/10/21/chartex" xmlns:cx3="http://schemas.microsoft.com/office/drawing/2016/5/9/chartex" xmlns:cx4="http://schemas.microsoft.com/office/drawing/2016/5/10/chartex" xmlns:cx5="http://schemas.microsoft.com/office/drawing/2016/5/11/chartex" xmlns:cx6="http://schemas.microsoft.com/office/drawing/2016/5/12/chartex" xmlns:cx7="http://schemas.microsoft.com/office/drawing/2016/5/13/chartex" xmlns:cx8="http://schemas.microsoft.com/office/drawing/2016/5/14/chartex" xmlns:mc="http://schemas.openxmlformats.org/markup-compatibility/2006" xmlns:aink="http://schemas.microsoft.com/office/drawing/2016/ink" xmlns:am3d="http://schemas.microsoft.com/office/drawing/2017/model3d" xmlns:o="urn:schemas-microsoft-com:office:office" xmlns:oel="http://schemas.microsoft.com/office/2019/extlst" xmlns:r="http://schemas.openxmlformats.org/officeDocument/2006/relationships" xmlns:m="http://schemas.openxmlformats.org/officeDocument/2006/math" xmlns:v="urn:schemas-microsoft-com:vml" xmlns:wp14="http://schemas.microsoft.com/office/word/2010/wordprocessingDrawing" xmlns:wp="http://schemas.openxmlformats.org/drawingml/2006/wordprocessingDrawing" xmlns:w10="urn:schemas-microsoft-com:office:word" xmlns:w="http://schemas.openxmlformats.org/wordprocessingml/2006/main" xmlns:w14="http://schemas.microsoft.com/office/word/2010/wordml" xmlns:w15="http://schemas.microsoft.com/office/word/2012/wordml" xmlns:w16cex="http://schemas.microsoft.com/office/word/2018/wordml/cex" xmlns:w16cid="http://schemas.microsoft.com/office/word/2016/wordml/cid" xmlns:w16="http://schemas.microsoft.com/office/word/2018/wordml" xmlns:w16du="http://schemas.microsoft.com/office/word/2023/wordml/word16du" xmlns:w16sdtdh="http://schemas.microsoft.com/office/word/2020/wordml/sdtdatahash" xmlns:w16sdtfl="http://schemas.microsoft.com/office/word/2024/wordml/sdtformatlock" xmlns:w16se="http://schemas.microsoft.com/office/word/2015/wordml/symex" xmlns:wpg="http://schemas.microsoft.com/office/word/2010/wordprocessingGroup" xmlns:wpi="http://schemas.microsoft.com/office/word/2010/wordprocessingInk" xmlns:wne="http://schemas.microsoft.com/office/word/2006/wordml" xmlns:wps="http://schemas.microsoft.com/office/word/2010/wordprocessingShape" mc:Ignorable="w14 w15 w16se w16cid w16 w16cex w16sdtdh w16sdtfl w16du wp14">
+  <w:endnote w:type="separator" w:id="-1">
+    <w:p>
+      <w:r>
+        <w:separator/>
+      </w:r>
+    </w:p>
+  </w:endnote>
+  <w:endnote w:type="continuationSeparator" w:id="0">
+    <w:p>
+      <w:r>
+        <w:continuationSeparator/>
+      </w:r>
+    </w:p>
+  </w:endnote>
+</w:endnotes>
+</file>
+
+<file path=word/footnotes.xml><?xml version="1.0" encoding="utf-8"?>
+<w:footnotes xmlns:wpc="http://schemas.microsoft.com/office/word/2010/wordprocessingCanvas" xmlns:cx="http://schemas.microsoft.com/office/drawing/2014/chartex" xmlns:cx1="http://schemas.microsoft.com/office/drawing/2015/9/8/chartex" xmlns:cx2="http://schemas.microsoft.com/office/drawing/2015/10/21/chartex" xmlns:cx3="http://schemas.microsoft.com/office/drawing/2016/5/9/chartex" xmlns:cx4="http://schemas.microsoft.com/office/drawing/2016/5/10/chartex" xmlns:cx5="http://schemas.microsoft.com/office/drawing/2016/5/11/chartex" xmlns:cx6="http://schemas.microsoft.com/office/drawing/2016/5/12/chartex" xmlns:cx7="http://schemas.microsoft.com/office/drawing/2016/5/13/chartex" xmlns:cx8="http://schemas.microsoft.com/office/drawing/2016/5/14/chartex" xmlns:mc="http://schemas.openxmlformats.org/markup-compatibility/2006" xmlns:aink="http://schemas.microsoft.com/office/drawing/2016/ink" xmlns:am3d="http://schemas.microsoft.com/office/drawing/2017/model3d" xmlns:o="urn:schemas-microsoft-com:office:office" xmlns:oel="http://schemas.microsoft.com/office/2019/extlst" xmlns:r="http://schemas.openxmlformats.org/officeDocument/2006/relationships" xmlns:m="http://schemas.openxmlformats.org/officeDocument/2006/math" xmlns:v="urn:schemas-microsoft-com:vml" xmlns:wp14="http://schemas.microsoft.com/office/word/2010/wordprocessingDrawing" xmlns:wp="http://schemas.openxmlformats.org/drawingml/2006/wordprocessingDrawing" xmlns:w10="urn:schemas-microsoft-com:office:word" xmlns:w="http://schemas.openxmlformats.org/wordprocessingml/2006/main" xmlns:w14="http://schemas.microsoft.com/office/word/2010/wordml" xmlns:w15="http://schemas.microsoft.com/office/word/2012/wordml" xmlns:w16cex="http://schemas.microsoft.com/office/word/2018/wordml/cex" xmlns:w16cid="http://schemas.microsoft.com/office/word/2016/wordml/cid" xmlns:w16="http://schemas.microsoft.com/office/word/2018/wordml" xmlns:w16du="http://schemas.microsoft.com/office/word/2023/wordml/word16du" xmlns:w16sdtdh="http://schemas.microsoft.com/office/word/2020/wordml/sdtdatahash" xmlns:w16sdtfl="http://schemas.microsoft.com/office/word/2024/wordml/sdtformatlock" xmlns:w16se="http://schemas.microsoft.com/office/word/2015/wordml/symex" xmlns:wpg="http://schemas.microsoft.com/office/word/2010/wordprocessingGroup" xmlns:wpi="http://schemas.microsoft.com/office/word/2010/wordprocessingInk" xmlns:wne="http://schemas.microsoft.com/office/word/2006/wordml" xmlns:wps="http://schemas.microsoft.com/office/word/2010/wordprocessingShape" mc:Ignorable="w14 w15 w16se w16cid w16 w16cex w16sdtdh w16sdtfl w16du wp14">
+  <w:footnote w:type="separator" w:id="-1">
+    <w:p>
+      <w:r>
+        <w:separator/>
+      </w:r>
+    </w:p>
+  </w:footnote>
+  <w:footnote w:type="continuationSeparator" w:id="0">
+    <w:p>
+      <w:r>
+        <w:continuationSeparator/>
+      </w:r>
+    </w:p>
+  </w:footnote>
+</w:footnotes>
 </file>
 
 <file path=word/styles.xml><?xml version="1.0" encoding="utf-8"?>
@@ -1298,6 +1420,70 @@
       <w:spacing w:val="5"/>
     </w:rPr>
   </w:style>
+  <w:style w:type="paragraph" w:styleId="ae">
+    <w:name w:val="header"/>
+    <w:basedOn w:val="a"/>
+    <w:link w:val="af"/>
+    <w:uiPriority w:val="99"/>
+    <w:unhideWhenUsed/>
+    <w:rsid w:val="005A6DE5"/>
+    <w:pPr>
+      <w:tabs>
+        <w:tab w:val="center" w:pos="4153"/>
+        <w:tab w:val="right" w:pos="8306"/>
+      </w:tabs>
+      <w:snapToGrid w:val="0"/>
+      <w:jc w:val="center"/>
+    </w:pPr>
+    <w:rPr>
+      <w:sz w:val="18"/>
+      <w:szCs w:val="18"/>
+    </w:rPr>
+  </w:style>
+  <w:style w:type="character" w:customStyle="1" w:styleId="af">
+    <w:name w:val="页眉 字符"/>
+    <w:basedOn w:val="a0"/>
+    <w:link w:val="ae"/>
+    <w:uiPriority w:val="99"/>
+    <w:rsid w:val="005A6DE5"/>
+    <w:rPr>
+      <w:rFonts w:eastAsia="更纱黑体 SC"/>
+      <w:sz w:val="18"/>
+      <w:szCs w:val="18"/>
+    </w:rPr>
+  </w:style>
+  <w:style w:type="paragraph" w:styleId="af0">
+    <w:name w:val="footer"/>
+    <w:basedOn w:val="a"/>
+    <w:link w:val="af1"/>
+    <w:uiPriority w:val="99"/>
+    <w:unhideWhenUsed/>
+    <w:rsid w:val="005A6DE5"/>
+    <w:pPr>
+      <w:tabs>
+        <w:tab w:val="center" w:pos="4153"/>
+        <w:tab w:val="right" w:pos="8306"/>
+      </w:tabs>
+      <w:snapToGrid w:val="0"/>
+      <w:jc w:val="left"/>
+    </w:pPr>
+    <w:rPr>
+      <w:sz w:val="18"/>
+      <w:szCs w:val="18"/>
+    </w:rPr>
+  </w:style>
+  <w:style w:type="character" w:customStyle="1" w:styleId="af1">
+    <w:name w:val="页脚 字符"/>
+    <w:basedOn w:val="a0"/>
+    <w:link w:val="af0"/>
+    <w:uiPriority w:val="99"/>
+    <w:rsid w:val="005A6DE5"/>
+    <w:rPr>
+      <w:rFonts w:eastAsia="更纱黑体 SC"/>
+      <w:sz w:val="18"/>
+      <w:szCs w:val="18"/>
+    </w:rPr>
+  </w:style>
 </w:styles>
 </file>
 

</xml_diff>